<commit_message>
Ajuste menor a la letra
</commit_message>
<xml_diff>
--- a/Servicio Control de Accesos - Enunciado.docx
+++ b/Servicio Control de Accesos - Enunciado.docx
@@ -387,7 +387,15 @@
           <w:sz w:val="22"/>
           <w:szCs w:val="22"/>
         </w:rPr>
-        <w:t>la operación GET localhost:8080/todos</w:t>
+        <w:t xml:space="preserve">la operación </w:t>
+      </w:r>
+      <w:r>
+        <w:rPr>
+          <w:rFonts w:ascii="Courier New" w:hAnsi="Courier New" w:cs="Courier New"/>
+          <w:sz w:val="22"/>
+          <w:szCs w:val="22"/>
+        </w:rPr>
+        <w:t>GET localhost:8080/todos</w:t>
       </w:r>
     </w:p>
     <w:sectPr>

</xml_diff>

<commit_message>
commit prueba repo clonado
</commit_message>
<xml_diff>
--- a/Servicio Control de Accesos - Enunciado.docx
+++ b/Servicio Control de Accesos - Enunciado.docx
@@ -4,7 +4,7 @@
   <w:body>
     <w:p>
       <w:pPr>
-        <w:pStyle w:val="Heading2"/>
+        <w:pStyle w:val="Ttulo2"/>
         <w:ind w:left="2" w:hanging="4"/>
         <w:jc w:val="center"/>
       </w:pPr>
@@ -226,7 +226,7 @@
     </w:p>
     <w:p>
       <w:pPr>
-        <w:pStyle w:val="ListParagraph"/>
+        <w:pStyle w:val="Prrafodelista"/>
         <w:numPr>
           <w:ilvl w:val="0"/>
           <w:numId w:val="5"/>
@@ -1442,7 +1442,7 @@
       <w:position w:val="-1"/>
     </w:rPr>
   </w:style>
-  <w:style w:type="paragraph" w:styleId="Heading1">
+  <w:style w:type="paragraph" w:styleId="Ttulo1">
     <w:name w:val="heading 1"/>
     <w:basedOn w:val="Normal"/>
     <w:next w:val="Normal"/>
@@ -1459,7 +1459,7 @@
       <w:szCs w:val="48"/>
     </w:rPr>
   </w:style>
-  <w:style w:type="paragraph" w:styleId="Heading2">
+  <w:style w:type="paragraph" w:styleId="Ttulo2">
     <w:name w:val="heading 2"/>
     <w:basedOn w:val="Normal"/>
     <w:next w:val="Normal"/>
@@ -1478,7 +1478,7 @@
       <w:szCs w:val="36"/>
     </w:rPr>
   </w:style>
-  <w:style w:type="paragraph" w:styleId="Heading3">
+  <w:style w:type="paragraph" w:styleId="Ttulo3">
     <w:name w:val="heading 3"/>
     <w:basedOn w:val="Normal"/>
     <w:next w:val="Normal"/>
@@ -1498,7 +1498,7 @@
       <w:szCs w:val="28"/>
     </w:rPr>
   </w:style>
-  <w:style w:type="paragraph" w:styleId="Heading4">
+  <w:style w:type="paragraph" w:styleId="Ttulo4">
     <w:name w:val="heading 4"/>
     <w:basedOn w:val="Normal"/>
     <w:next w:val="Normal"/>
@@ -1518,7 +1518,7 @@
       <w:szCs w:val="24"/>
     </w:rPr>
   </w:style>
-  <w:style w:type="paragraph" w:styleId="Heading5">
+  <w:style w:type="paragraph" w:styleId="Ttulo5">
     <w:name w:val="heading 5"/>
     <w:basedOn w:val="Normal"/>
     <w:next w:val="Normal"/>
@@ -1538,7 +1538,7 @@
       <w:szCs w:val="22"/>
     </w:rPr>
   </w:style>
-  <w:style w:type="paragraph" w:styleId="Heading6">
+  <w:style w:type="paragraph" w:styleId="Ttulo6">
     <w:name w:val="heading 6"/>
     <w:basedOn w:val="Normal"/>
     <w:next w:val="Normal"/>
@@ -1556,13 +1556,13 @@
       <w:b/>
     </w:rPr>
   </w:style>
-  <w:style w:type="character" w:default="1" w:styleId="DefaultParagraphFont">
+  <w:style w:type="character" w:default="1" w:styleId="Fuentedeprrafopredeter">
     <w:name w:val="Default Paragraph Font"/>
     <w:uiPriority w:val="1"/>
     <w:semiHidden/>
     <w:unhideWhenUsed/>
   </w:style>
-  <w:style w:type="table" w:default="1" w:styleId="TableNormal">
+  <w:style w:type="table" w:default="1" w:styleId="Tablanormal">
     <w:name w:val="Normal Table"/>
     <w:uiPriority w:val="99"/>
     <w:semiHidden/>
@@ -1577,13 +1577,13 @@
       </w:tblCellMar>
     </w:tblPr>
   </w:style>
-  <w:style w:type="numbering" w:default="1" w:styleId="NoList">
+  <w:style w:type="numbering" w:default="1" w:styleId="Sinlista">
     <w:name w:val="No List"/>
     <w:uiPriority w:val="99"/>
     <w:semiHidden/>
     <w:unhideWhenUsed/>
   </w:style>
-  <w:style w:type="paragraph" w:styleId="Title">
+  <w:style w:type="paragraph" w:styleId="Ttulo">
     <w:name w:val="Title"/>
     <w:basedOn w:val="Normal"/>
     <w:next w:val="Normal"/>
@@ -1600,7 +1600,7 @@
       <w:szCs w:val="72"/>
     </w:rPr>
   </w:style>
-  <w:style w:type="paragraph" w:styleId="BalloonText">
+  <w:style w:type="paragraph" w:styleId="Textodeglobo">
     <w:name w:val="Balloon Text"/>
     <w:basedOn w:val="Normal"/>
     <w:qFormat/>
@@ -1625,7 +1625,7 @@
       <w:lang w:val="es-ES" w:eastAsia="es-ES"/>
     </w:rPr>
   </w:style>
-  <w:style w:type="paragraph" w:styleId="Header">
+  <w:style w:type="paragraph" w:styleId="Encabezado">
     <w:name w:val="header"/>
     <w:basedOn w:val="Normal"/>
     <w:qFormat/>
@@ -1648,7 +1648,7 @@
       <w:em w:val="none"/>
     </w:rPr>
   </w:style>
-  <w:style w:type="paragraph" w:styleId="Footer">
+  <w:style w:type="paragraph" w:styleId="Piedepgina">
     <w:name w:val="footer"/>
     <w:basedOn w:val="Normal"/>
     <w:qFormat/>
@@ -1671,7 +1671,7 @@
       <w:em w:val="none"/>
     </w:rPr>
   </w:style>
-  <w:style w:type="paragraph" w:styleId="Subtitle">
+  <w:style w:type="paragraph" w:styleId="Subttulo">
     <w:name w:val="Subtitle"/>
     <w:basedOn w:val="Normal"/>
     <w:next w:val="Normal"/>
@@ -1690,7 +1690,7 @@
       <w:szCs w:val="48"/>
     </w:rPr>
   </w:style>
-  <w:style w:type="paragraph" w:styleId="ListParagraph">
+  <w:style w:type="paragraph" w:styleId="Prrafodelista">
     <w:name w:val="List Paragraph"/>
     <w:basedOn w:val="Normal"/>
     <w:uiPriority w:val="34"/>

</xml_diff>